<commit_message>
Continued attempting to optimise
</commit_message>
<xml_diff>
--- a/Sudoku solving analysis.docx
+++ b/Sudoku solving analysis.docx
@@ -190,7 +190,13 @@
         </w:r>
       </w:hyperlink>
       <w:r>
-        <w:t xml:space="preserve"> state and ending at </w:t>
+        <w:t xml:space="preserve"> </w:t>
+      </w:r>
+      <w:r>
+        <w:t xml:space="preserve">puzzle </w:t>
+      </w:r>
+      <w:r>
+        <w:t xml:space="preserve">state and ending at </w:t>
       </w:r>
       <w:r>
         <w:t xml:space="preserve">the corresponding </w:t>
@@ -208,6 +214,11 @@
       </w:r>
     </w:p>
     <w:p>
+      <w:r>
+        <w:t>Note then that while the graph doesn’t have inherent direction, whether we consider it to be directed or undirected depends on whether we allow the algorithm to change the non-null values in the cells. If we only allow the algorithm to edit the values of nulled cells (i.e., to add values to empty cells), we can consider the graph as directed as we may only traverse it in one direction, but if we allow it to edit values in filled cells the graph traversal becomes bidirectional.</w:t>
+      </w:r>
+    </w:p>
+    <w:p>
       <w:pPr>
         <w:pStyle w:val="Heading1"/>
       </w:pPr>
@@ -305,6 +316,7 @@
     </w:p>
     <w:p>
       <w:r>
+        <w:lastRenderedPageBreak/>
         <w:t xml:space="preserve">A valid puzzle </w:t>
       </w:r>
       <w:r>
@@ -388,7 +400,6 @@
       <w:bookmarkEnd w:id="8"/>
       <w:bookmarkEnd w:id="9"/>
       <w:r>
-        <w:lastRenderedPageBreak/>
         <w:t>S</w:t>
       </w:r>
       <w:r>

</xml_diff>